<commit_message>
feat(android): app Android con Capacitor 7 y APK; informe final completo
</commit_message>
<xml_diff>
--- a/Fase 2/Evidencias Grupales/Cayuqueo_Alex_2_6_GuiaEstudiante_Fase_2_InformeFinal_Proyecto_APT.docx
+++ b/Fase 2/Evidencias Grupales/Cayuqueo_Alex_2_6_GuiaEstudiante_Fase_2_InformeFinal_Proyecto_APT.docx
@@ -1768,7 +1768,7 @@
                 <w:sz w:val="20"/>
                 <w:szCs w:val="20"/>
               </w:rPr>
-              <w:t xml:space="preserve"> (25–30 oct.): aplicación Android, informe final y presentación.</w:t>
+              <w:t xml:space="preserve"> (25–30 oct.): aplicación Android con Capacitor (APK de 4,0 MB probada en emulador), informe final y presentación.</w:t>
             </w:r>
           </w:p>
           <w:p>
@@ -2129,7 +2129,7 @@
                 <w:sz w:val="20"/>
                 <w:szCs w:val="20"/>
               </w:rPr>
-              <w:t xml:space="preserve"> con 35 commits trazables al tablero: https://github.com/alcayuqueo/proyectCAPSTON</w:t>
+              <w:t xml:space="preserve"> con 37 commits trazables al tablero: https://github.com/alcayuqueo/proyectCAPSTON</w:t>
             </w:r>
           </w:p>
           <w:p>
@@ -2157,7 +2157,7 @@
                 <w:sz w:val="20"/>
                 <w:szCs w:val="20"/>
               </w:rPr>
-              <w:t xml:space="preserve"> con 23 figuras y 13 tablas (Fase 2/Evidencias Proyecto).</w:t>
+              <w:t xml:space="preserve"> «Cayuqueo_Alex_Informe_Final_Fase2_Software_Educativo.docx», con el detalle de cada apartado, 25 figuras y 13 tablas (Fase 2/Evidencias Proyecto).</w:t>
             </w:r>
           </w:p>
           <w:p>
@@ -2214,6 +2214,34 @@
                 <w:szCs w:val="20"/>
               </w:rPr>
               <w:t xml:space="preserve"> 54 pruebas Jest (unitarias y de seguridad), 40 de API, 35 de datos, 63 de interfaz con Playwright, Lighthouse 99–100 y prueba de carga sin errores con 50 usuarios (docs/pruebas).</w:t>
+            </w:r>
+          </w:p>
+          <w:p>
+            <w:pPr>
+              <w:numPr>
+                <w:ilvl w:val="0"/>
+                <w:numId w:val="6"/>
+              </w:numPr>
+              <w:spacing w:before="0" w:after="40" w:line="259" w:lineRule="auto"/>
+            </w:pPr>
+            <w:r>
+              <w:rPr>
+                <w:rFonts w:ascii="Calibri" w:hAnsi="Calibri" w:cs="Calibri"/>
+                <w:b/>
+                <w:color w:val="1F1F1F"/>
+                <w:sz w:val="20"/>
+                <w:szCs w:val="20"/>
+              </w:rPr>
+              <w:t xml:space="preserve">App Android (APK)</w:t>
+            </w:r>
+            <w:r>
+              <w:rPr>
+                <w:rFonts w:ascii="Calibri" w:hAnsi="Calibri" w:cs="Calibri"/>
+                <w:color w:val="1F1F1F"/>
+                <w:sz w:val="20"/>
+                <w:szCs w:val="20"/>
+              </w:rPr>
+              <w:t xml:space="preserve"> generada con Capacitor y probada en el emulador de Android Studio (capturas del paso 17).</w:t>
             </w:r>
           </w:p>
           <w:p>
@@ -2525,21 +2553,6 @@
               <w:t xml:space="preserve">Me proyecto como desarrollador full stack en tecnología educativa o en el sector público, aportando lo técnico y el conocimiento de las licitaciones. En lo inmediato, quiero presentar Software Educativo en mi empresa como complemento de las pantallas interactivas y buscar un piloto con un establecimiento.</w:t>
             </w:r>
           </w:p>
-          <w:p>
-            <w:pPr>
-              <w:spacing w:before="0" w:after="80" w:line="259" w:lineRule="auto"/>
-              <w:jc w:val="left"/>
-            </w:pPr>
-            <w:r>
-              <w:rPr>
-                <w:rFonts w:ascii="Calibri" w:hAnsi="Calibri" w:cs="Calibri"/>
-                <w:color w:val="1F1F1F"/>
-                <w:sz w:val="20"/>
-                <w:szCs w:val="20"/>
-              </w:rPr>
-              <w:t xml:space="preserve">El detalle de cada apartado, con figuras y tablas, está en el informe técnico «Cayuqueo_Alex_Informe_Final_Fase2_Software_Educativo.docx» (Fase 2/Evidencias Proyecto).</w:t>
-            </w:r>
-          </w:p>
         </w:tc>
       </w:tr>
     </w:tbl>
@@ -2547,19 +2560,6 @@
       <w:pPr>
         <w:rPr>
           <w:b/>
-        </w:rPr>
-      </w:pPr>
-    </w:p>
-    <w:p>
-      <w:pPr>
-        <w:spacing w:after="0" w:line="276" w:lineRule="auto"/>
-        <w:ind w:left="-426" w:right="-568"/>
-        <w:jc w:val="both"/>
-        <w:rPr>
-          <w:rFonts w:eastAsiaTheme="majorEastAsia" w:cstheme="minorHAnsi"/>
-          <w:color w:val="767171" w:themeColor="background2" w:themeShade="80"/>
-          <w:sz w:val="24"/>
-          <w:szCs w:val="24"/>
         </w:rPr>
       </w:pPr>
     </w:p>

</xml_diff>